<commit_message>
updated java interview questions
</commit_message>
<xml_diff>
--- a/LeetCode/LeetcodeStrings/Strings LeetCode.docx
+++ b/LeetCode/LeetcodeStrings/Strings LeetCode.docx
@@ -4,7 +4,15 @@
   <w:body>
     <w:p>
       <w:r>
-        <w:t>Add Strings LeetCode:</w:t>
+        <w:t xml:space="preserve">Add Strings </w:t>
+      </w:r>
+      <w:proofErr w:type="spellStart"/>
+      <w:r>
+        <w:t>LeetCode</w:t>
+      </w:r>
+      <w:proofErr w:type="spellEnd"/>
+      <w:r>
+        <w:t>:</w:t>
       </w:r>
       <w:r>
         <w:br/>
@@ -57,7 +65,15 @@
       </w:r>
       <w:r>
         <w:br/>
-        <w:t xml:space="preserve">We will convert string to BigInteger </w:t>
+        <w:t xml:space="preserve">We will convert string to </w:t>
+      </w:r>
+      <w:proofErr w:type="spellStart"/>
+      <w:r>
+        <w:t>BigInteger</w:t>
+      </w:r>
+      <w:proofErr w:type="spellEnd"/>
+      <w:r>
+        <w:t xml:space="preserve"> </w:t>
       </w:r>
       <w:r>
         <w:br/>
@@ -333,7 +349,15 @@
       </w:r>
       <w:r>
         <w:br/>
-        <w:t>In this we will compare from two pointer approach we will compare from left and right for this to palindrome both characters from left should equal to right except the exception i==j</w:t>
+        <w:t xml:space="preserve">In this we will compare from two pointer approach we will compare from left and right for this to palindrome both characters from left should equal to right except the exception </w:t>
+      </w:r>
+      <w:proofErr w:type="spellStart"/>
+      <w:r>
+        <w:t>i</w:t>
+      </w:r>
+      <w:proofErr w:type="spellEnd"/>
+      <w:r>
+        <w:t>==j</w:t>
       </w:r>
       <w:r>
         <w:br/>
@@ -506,7 +530,15 @@
       </w:r>
       <w:r>
         <w:br/>
-        <w:t>haystack=sadbutsad -&gt; length=9 index from 0 to 8</w:t>
+        <w:t>haystack=</w:t>
+      </w:r>
+      <w:proofErr w:type="spellStart"/>
+      <w:r>
+        <w:t>sadbutsad</w:t>
+      </w:r>
+      <w:proofErr w:type="spellEnd"/>
+      <w:r>
+        <w:t xml:space="preserve"> -&gt; length=9 index from 0 to 8</w:t>
       </w:r>
       <w:r>
         <w:br/>
@@ -516,11 +548,39 @@
       </w:r>
       <w:r>
         <w:br/>
-        <w:t>so when i=0 , j should minimum be 3 and when i increases j should also increment upto</w:t>
-      </w:r>
-      <w:r>
-        <w:br/>
-        <w:t>haystack.length()</w:t>
+        <w:t xml:space="preserve">so when </w:t>
+      </w:r>
+      <w:proofErr w:type="spellStart"/>
+      <w:r>
+        <w:t>i</w:t>
+      </w:r>
+      <w:proofErr w:type="spellEnd"/>
+      <w:r>
+        <w:t xml:space="preserve">=0 , j should minimum be 3 and when </w:t>
+      </w:r>
+      <w:proofErr w:type="spellStart"/>
+      <w:r>
+        <w:t>i</w:t>
+      </w:r>
+      <w:proofErr w:type="spellEnd"/>
+      <w:r>
+        <w:t xml:space="preserve"> increases j should also increment </w:t>
+      </w:r>
+      <w:proofErr w:type="spellStart"/>
+      <w:r>
+        <w:t>upto</w:t>
+      </w:r>
+      <w:proofErr w:type="spellEnd"/>
+      <w:r>
+        <w:br/>
+      </w:r>
+      <w:proofErr w:type="spellStart"/>
+      <w:r>
+        <w:t>haystack.length</w:t>
+      </w:r>
+      <w:proofErr w:type="spellEnd"/>
+      <w:r>
+        <w:t>()</w:t>
       </w:r>
     </w:p>
     <w:p>
@@ -697,7 +757,15 @@
         <w:t xml:space="preserve">[2]To </w:t>
       </w:r>
       <w:r>
-        <w:t>remove extra space between words-&gt; String output=s.replaceAll(</w:t>
+        <w:t>remove extra space between words-&gt; String output=</w:t>
+      </w:r>
+      <w:proofErr w:type="spellStart"/>
+      <w:r>
+        <w:t>s.replaceAll</w:t>
+      </w:r>
+      <w:proofErr w:type="spellEnd"/>
+      <w:r>
+        <w:t>(</w:t>
       </w:r>
       <w:hyperlink r:id="rId19" w:history="1">
         <w:r>
@@ -718,7 +786,23 @@
         </w:rPr>
       </w:pPr>
       <w:r>
-        <w:t>[3]To append array of string words to a single string -&gt; String.join(“  “,rstrs);</w:t>
+        <w:t xml:space="preserve">[3]To append array of string words to a single string -&gt; </w:t>
+      </w:r>
+      <w:proofErr w:type="spellStart"/>
+      <w:r>
+        <w:t>String.join</w:t>
+      </w:r>
+      <w:proofErr w:type="spellEnd"/>
+      <w:r>
+        <w:t>(“  “,</w:t>
+      </w:r>
+      <w:proofErr w:type="spellStart"/>
+      <w:r>
+        <w:t>rstrs</w:t>
+      </w:r>
+      <w:proofErr w:type="spellEnd"/>
+      <w:r>
+        <w:t>);</w:t>
       </w:r>
       <w:r>
         <w:br/>
@@ -1000,8 +1084,13 @@
         <w:br/>
         <w:t xml:space="preserve">Valid </w:t>
       </w:r>
-      <w:r>
-        <w:t>Paranthesis :</w:t>
+      <w:proofErr w:type="spellStart"/>
+      <w:r>
+        <w:t>Paranthesis</w:t>
+      </w:r>
+      <w:proofErr w:type="spellEnd"/>
+      <w:r>
+        <w:t xml:space="preserve"> :</w:t>
       </w:r>
       <w:r>
         <w:br/>
@@ -1045,7 +1134,35 @@
         <w:rPr>
           <w:highlight w:val="yellow"/>
         </w:rPr>
-        <w:t>    public boolean isValid(String s) {</w:t>
+        <w:t xml:space="preserve">    public </w:t>
+      </w:r>
+      <w:proofErr w:type="spellStart"/>
+      <w:r>
+        <w:rPr>
+          <w:highlight w:val="yellow"/>
+        </w:rPr>
+        <w:t>boolean</w:t>
+      </w:r>
+      <w:proofErr w:type="spellEnd"/>
+      <w:r>
+        <w:rPr>
+          <w:highlight w:val="yellow"/>
+        </w:rPr>
+        <w:t xml:space="preserve"> </w:t>
+      </w:r>
+      <w:proofErr w:type="spellStart"/>
+      <w:r>
+        <w:rPr>
+          <w:highlight w:val="yellow"/>
+        </w:rPr>
+        <w:t>isValid</w:t>
+      </w:r>
+      <w:proofErr w:type="spellEnd"/>
+      <w:r>
+        <w:rPr>
+          <w:highlight w:val="yellow"/>
+        </w:rPr>
+        <w:t>(String s) {</w:t>
       </w:r>
     </w:p>
     <w:p>
@@ -1071,7 +1188,49 @@
         <w:rPr>
           <w:highlight w:val="yellow"/>
         </w:rPr>
-        <w:t>        for(int i=0;i&lt;s.length();i++){</w:t>
+        <w:t xml:space="preserve">        for(int </w:t>
+      </w:r>
+      <w:proofErr w:type="spellStart"/>
+      <w:r>
+        <w:rPr>
+          <w:highlight w:val="yellow"/>
+        </w:rPr>
+        <w:t>i</w:t>
+      </w:r>
+      <w:proofErr w:type="spellEnd"/>
+      <w:r>
+        <w:rPr>
+          <w:highlight w:val="yellow"/>
+        </w:rPr>
+        <w:t>=0;i&lt;</w:t>
+      </w:r>
+      <w:proofErr w:type="spellStart"/>
+      <w:r>
+        <w:rPr>
+          <w:highlight w:val="yellow"/>
+        </w:rPr>
+        <w:t>s.length</w:t>
+      </w:r>
+      <w:proofErr w:type="spellEnd"/>
+      <w:r>
+        <w:rPr>
+          <w:highlight w:val="yellow"/>
+        </w:rPr>
+        <w:t>();</w:t>
+      </w:r>
+      <w:proofErr w:type="spellStart"/>
+      <w:r>
+        <w:rPr>
+          <w:highlight w:val="yellow"/>
+        </w:rPr>
+        <w:t>i</w:t>
+      </w:r>
+      <w:proofErr w:type="spellEnd"/>
+      <w:r>
+        <w:rPr>
+          <w:highlight w:val="yellow"/>
+        </w:rPr>
+        <w:t>++){</w:t>
       </w:r>
     </w:p>
     <w:p>
@@ -1084,7 +1243,49 @@
         <w:rPr>
           <w:highlight w:val="yellow"/>
         </w:rPr>
-        <w:t>        char ch = s.charAt(i);</w:t>
+        <w:t xml:space="preserve">        char </w:t>
+      </w:r>
+      <w:proofErr w:type="spellStart"/>
+      <w:r>
+        <w:rPr>
+          <w:highlight w:val="yellow"/>
+        </w:rPr>
+        <w:t>ch</w:t>
+      </w:r>
+      <w:proofErr w:type="spellEnd"/>
+      <w:r>
+        <w:rPr>
+          <w:highlight w:val="yellow"/>
+        </w:rPr>
+        <w:t xml:space="preserve"> = </w:t>
+      </w:r>
+      <w:proofErr w:type="spellStart"/>
+      <w:r>
+        <w:rPr>
+          <w:highlight w:val="yellow"/>
+        </w:rPr>
+        <w:t>s.charAt</w:t>
+      </w:r>
+      <w:proofErr w:type="spellEnd"/>
+      <w:r>
+        <w:rPr>
+          <w:highlight w:val="yellow"/>
+        </w:rPr>
+        <w:t>(</w:t>
+      </w:r>
+      <w:proofErr w:type="spellStart"/>
+      <w:r>
+        <w:rPr>
+          <w:highlight w:val="yellow"/>
+        </w:rPr>
+        <w:t>i</w:t>
+      </w:r>
+      <w:proofErr w:type="spellEnd"/>
+      <w:r>
+        <w:rPr>
+          <w:highlight w:val="yellow"/>
+        </w:rPr>
+        <w:t>);</w:t>
       </w:r>
     </w:p>
     <w:p>
@@ -1097,7 +1298,49 @@
         <w:rPr>
           <w:highlight w:val="yellow"/>
         </w:rPr>
-        <w:t>        if(ch == '(' || ch == '{' || ch =='['){</w:t>
+        <w:t>        if(</w:t>
+      </w:r>
+      <w:proofErr w:type="spellStart"/>
+      <w:r>
+        <w:rPr>
+          <w:highlight w:val="yellow"/>
+        </w:rPr>
+        <w:t>ch</w:t>
+      </w:r>
+      <w:proofErr w:type="spellEnd"/>
+      <w:r>
+        <w:rPr>
+          <w:highlight w:val="yellow"/>
+        </w:rPr>
+        <w:t xml:space="preserve"> == '(' || </w:t>
+      </w:r>
+      <w:proofErr w:type="spellStart"/>
+      <w:r>
+        <w:rPr>
+          <w:highlight w:val="yellow"/>
+        </w:rPr>
+        <w:t>ch</w:t>
+      </w:r>
+      <w:proofErr w:type="spellEnd"/>
+      <w:r>
+        <w:rPr>
+          <w:highlight w:val="yellow"/>
+        </w:rPr>
+        <w:t xml:space="preserve"> == '{' || </w:t>
+      </w:r>
+      <w:proofErr w:type="spellStart"/>
+      <w:r>
+        <w:rPr>
+          <w:highlight w:val="yellow"/>
+        </w:rPr>
+        <w:t>ch</w:t>
+      </w:r>
+      <w:proofErr w:type="spellEnd"/>
+      <w:r>
+        <w:rPr>
+          <w:highlight w:val="yellow"/>
+        </w:rPr>
+        <w:t xml:space="preserve"> =='['){</w:t>
       </w:r>
     </w:p>
     <w:p>
@@ -1110,7 +1353,35 @@
         <w:rPr>
           <w:highlight w:val="yellow"/>
         </w:rPr>
-        <w:t>            stack.push(ch);</w:t>
+        <w:t xml:space="preserve">            </w:t>
+      </w:r>
+      <w:proofErr w:type="spellStart"/>
+      <w:r>
+        <w:rPr>
+          <w:highlight w:val="yellow"/>
+        </w:rPr>
+        <w:t>stack.push</w:t>
+      </w:r>
+      <w:proofErr w:type="spellEnd"/>
+      <w:r>
+        <w:rPr>
+          <w:highlight w:val="yellow"/>
+        </w:rPr>
+        <w:t>(</w:t>
+      </w:r>
+      <w:proofErr w:type="spellStart"/>
+      <w:r>
+        <w:rPr>
+          <w:highlight w:val="yellow"/>
+        </w:rPr>
+        <w:t>ch</w:t>
+      </w:r>
+      <w:proofErr w:type="spellEnd"/>
+      <w:r>
+        <w:rPr>
+          <w:highlight w:val="yellow"/>
+        </w:rPr>
+        <w:t>);</w:t>
       </w:r>
     </w:p>
     <w:p>
@@ -1136,7 +1407,21 @@
         <w:rPr>
           <w:highlight w:val="yellow"/>
         </w:rPr>
-        <w:t>            if(stack.isEmpty()){</w:t>
+        <w:t>            if(</w:t>
+      </w:r>
+      <w:proofErr w:type="spellStart"/>
+      <w:r>
+        <w:rPr>
+          <w:highlight w:val="yellow"/>
+        </w:rPr>
+        <w:t>stack.isEmpty</w:t>
+      </w:r>
+      <w:proofErr w:type="spellEnd"/>
+      <w:r>
+        <w:rPr>
+          <w:highlight w:val="yellow"/>
+        </w:rPr>
+        <w:t>()){</w:t>
       </w:r>
     </w:p>
     <w:p>
@@ -1175,7 +1460,21 @@
         <w:rPr>
           <w:highlight w:val="yellow"/>
         </w:rPr>
-        <w:t>            char top = stack.peek();</w:t>
+        <w:t xml:space="preserve">            char top = </w:t>
+      </w:r>
+      <w:proofErr w:type="spellStart"/>
+      <w:r>
+        <w:rPr>
+          <w:highlight w:val="yellow"/>
+        </w:rPr>
+        <w:t>stack.peek</w:t>
+      </w:r>
+      <w:proofErr w:type="spellEnd"/>
+      <w:r>
+        <w:rPr>
+          <w:highlight w:val="yellow"/>
+        </w:rPr>
+        <w:t>();</w:t>
       </w:r>
     </w:p>
     <w:p>
@@ -1188,7 +1487,21 @@
         <w:rPr>
           <w:highlight w:val="yellow"/>
         </w:rPr>
-        <w:t>            if( ch == ')' &amp;&amp; top !='('){</w:t>
+        <w:t xml:space="preserve">            if( </w:t>
+      </w:r>
+      <w:proofErr w:type="spellStart"/>
+      <w:r>
+        <w:rPr>
+          <w:highlight w:val="yellow"/>
+        </w:rPr>
+        <w:t>ch</w:t>
+      </w:r>
+      <w:proofErr w:type="spellEnd"/>
+      <w:r>
+        <w:rPr>
+          <w:highlight w:val="yellow"/>
+        </w:rPr>
+        <w:t xml:space="preserve"> == ')' &amp;&amp; top !='('){</w:t>
       </w:r>
     </w:p>
     <w:p>
@@ -1214,7 +1527,21 @@
         <w:rPr>
           <w:highlight w:val="yellow"/>
         </w:rPr>
-        <w:t>            } else if ( ch == '}' &amp;&amp; top !='{'){</w:t>
+        <w:t xml:space="preserve">            } else if ( </w:t>
+      </w:r>
+      <w:proofErr w:type="spellStart"/>
+      <w:r>
+        <w:rPr>
+          <w:highlight w:val="yellow"/>
+        </w:rPr>
+        <w:t>ch</w:t>
+      </w:r>
+      <w:proofErr w:type="spellEnd"/>
+      <w:r>
+        <w:rPr>
+          <w:highlight w:val="yellow"/>
+        </w:rPr>
+        <w:t xml:space="preserve"> == '}' &amp;&amp; top !='{'){</w:t>
       </w:r>
     </w:p>
     <w:p>
@@ -1240,7 +1567,21 @@
         <w:rPr>
           <w:highlight w:val="yellow"/>
         </w:rPr>
-        <w:t>            } else if ( ch == ']' &amp;&amp; top !='['){</w:t>
+        <w:t xml:space="preserve">            } else if ( </w:t>
+      </w:r>
+      <w:proofErr w:type="spellStart"/>
+      <w:r>
+        <w:rPr>
+          <w:highlight w:val="yellow"/>
+        </w:rPr>
+        <w:t>ch</w:t>
+      </w:r>
+      <w:proofErr w:type="spellEnd"/>
+      <w:r>
+        <w:rPr>
+          <w:highlight w:val="yellow"/>
+        </w:rPr>
+        <w:t xml:space="preserve"> == ']' &amp;&amp; top !='['){</w:t>
       </w:r>
     </w:p>
     <w:p>
@@ -1279,7 +1620,21 @@
         <w:rPr>
           <w:highlight w:val="yellow"/>
         </w:rPr>
-        <w:t>                stack.pop();</w:t>
+        <w:t xml:space="preserve">                </w:t>
+      </w:r>
+      <w:proofErr w:type="spellStart"/>
+      <w:r>
+        <w:rPr>
+          <w:highlight w:val="yellow"/>
+        </w:rPr>
+        <w:t>stack.pop</w:t>
+      </w:r>
+      <w:proofErr w:type="spellEnd"/>
+      <w:r>
+        <w:rPr>
+          <w:highlight w:val="yellow"/>
+        </w:rPr>
+        <w:t>();</w:t>
       </w:r>
     </w:p>
     <w:p>
@@ -1331,7 +1686,21 @@
         <w:rPr>
           <w:highlight w:val="yellow"/>
         </w:rPr>
-        <w:t>       if(!stack.isEmpty()){</w:t>
+        <w:t>       if(!</w:t>
+      </w:r>
+      <w:proofErr w:type="spellStart"/>
+      <w:r>
+        <w:rPr>
+          <w:highlight w:val="yellow"/>
+        </w:rPr>
+        <w:t>stack.isEmpty</w:t>
+      </w:r>
+      <w:proofErr w:type="spellEnd"/>
+      <w:r>
+        <w:rPr>
+          <w:highlight w:val="yellow"/>
+        </w:rPr>
+        <w:t>()){</w:t>
       </w:r>
     </w:p>
     <w:p>
@@ -1453,6 +1822,9 @@
         <w:br/>
       </w:r>
       <w:r>
+        <w:rPr>
+          <w:noProof/>
+        </w:rPr>
         <w:drawing>
           <wp:inline distT="0" distB="0" distL="0" distR="0" wp14:anchorId="119CB22D" wp14:editId="436C14B5">
             <wp:extent cx="5591955" cy="5468113"/>
@@ -1493,6 +1865,9 @@
         <w:br/>
       </w:r>
       <w:r>
+        <w:rPr>
+          <w:noProof/>
+        </w:rPr>
         <w:lastRenderedPageBreak/>
         <w:drawing>
           <wp:inline distT="0" distB="0" distL="0" distR="0" wp14:anchorId="0CE921A0" wp14:editId="47C7A995">
@@ -1538,6 +1913,9 @@
         <w:br/>
       </w:r>
       <w:r>
+        <w:rPr>
+          <w:noProof/>
+        </w:rPr>
         <w:drawing>
           <wp:inline distT="0" distB="0" distL="0" distR="0" wp14:anchorId="4C307D4E" wp14:editId="1A086FA0">
             <wp:extent cx="5731510" cy="3547110"/>
@@ -1582,6 +1960,9 @@
         <w:br/>
       </w:r>
       <w:r>
+        <w:rPr>
+          <w:noProof/>
+        </w:rPr>
         <w:drawing>
           <wp:inline distT="0" distB="0" distL="0" distR="0" wp14:anchorId="04735F6B" wp14:editId="592035C1">
             <wp:extent cx="3991532" cy="3134162"/>
@@ -1655,6 +2036,9 @@
         <w:br/>
       </w:r>
       <w:r>
+        <w:rPr>
+          <w:noProof/>
+        </w:rPr>
         <w:drawing>
           <wp:inline distT="0" distB="0" distL="0" distR="0" wp14:anchorId="46C35CD3" wp14:editId="4FCCF486">
             <wp:extent cx="5163271" cy="3334215"/>
@@ -1696,10 +2080,21 @@
       </w:r>
       <w:r>
         <w:br/>
-      </w:r>
-    </w:p>
-    <w:p>
-      <w:r>
+        <w:t>-----------------------------------------------------------------------------------------------------------</w:t>
+      </w:r>
+      <w:r>
+        <w:br/>
+      </w:r>
+      <w:r>
+        <w:br/>
+      </w:r>
+      <w:r>
+        <w:br/>
+      </w:r>
+    </w:p>
+    <w:p>
+      <w:r>
+        <w:lastRenderedPageBreak/>
         <w:br/>
       </w:r>
     </w:p>
@@ -2316,6 +2711,7 @@
   <w:style w:type="character" w:default="1" w:styleId="DefaultParagraphFont">
     <w:name w:val="Default Paragraph Font"/>
     <w:uiPriority w:val="1"/>
+    <w:semiHidden/>
     <w:unhideWhenUsed/>
   </w:style>
   <w:style w:type="table" w:default="1" w:styleId="TableNormal">

</xml_diff>